<commit_message>
Add academy scenario and year plan; credit Mateusz Pichal
- New: full scenariusz akademii na 11 listopada (running order, roles,
  repertoire, prep timeline, jasełka variant).
- New: roczny rozkład materiału / plan wynikowy for klasa 4 (~32 lessons
  mapped to podstawa programowa), rendered in landscape .docx.
- Insert author "Mateusz Pichal" into the presentation (title/closing),
  report, lesson plans, and repertoire pack.
- Update README with the two new documents.

Co-Authored-By: Claude Opus 4.8 <noreply@anthropic.com>
Claude-Session: https://claude.ai/code/session_01WrWnzjDS4gKGgSt3A294G4
</commit_message>
<xml_diff>
--- a/edukacja-muzyczna-szkola-podstawowa/Raport-podstawa-programowa-muzyka.docx
+++ b/edukacja-muzyczna-szkola-podstawowa/Raport-podstawa-programowa-muzyka.docx
@@ -45,7 +45,21 @@
           <w:i/>
           <w:iCs/>
         </w:rPr>
-        <w:t xml:space="preserve">Opracowanie dla osoby rozpoczynającej prowadzenie zajęć śpiewu i muzyki w polskiej szkole podstawowej. Stan prawny: rok szkolny 2025/2026.</w:t>
+        <w:t xml:space="preserve">Opracowanie: </w:t>
+      </w:r>
+      <w:r>
+        <w:rPr>
+          <w:i/>
+          <w:iCs/>
+        </w:rPr>
+        <w:t xml:space="preserve">Mateusz Pichal</w:t>
+      </w:r>
+      <w:r>
+        <w:rPr>
+          <w:i/>
+          <w:iCs/>
+        </w:rPr>
+        <w:t xml:space="preserve">. Materiał dla osoby rozpoczynającej prowadzenie zajęć śpiewu i muzyki w polskiej szkole podstawowej. Stan prawny: rok szkolny 2025/2026.</w:t>
       </w:r>
     </w:p>
     <w:p>

</xml_diff>